<commit_message>
Sync context API task flow documentation
</commit_message>
<xml_diff>
--- a/context/docs/上下文工具接口文档（主要看这个）.docx
+++ b/context/docs/上下文工具接口文档（主要看这个）.docx
@@ -177,6 +177,48 @@
       <w:tr>
         <w:tc>
           <w:tcPr>
+            <w:tcW w:type="dxa" w:w="2628"/>
+          </w:tcPr>
+          <w:p>
+            <w:r>
+              <w:t>必须调用</w:t>
+            </w:r>
+          </w:p>
+        </w:tc>
+        <w:tc>
+          <w:tcPr>
+            <w:tcW w:type="dxa" w:w="2628"/>
+          </w:tcPr>
+          <w:p>
+            <w:r>
+              <w:t>GET /context/tasks?repo_id={repo_id}&amp;review_dimension={review_dimension}</w:t>
+            </w:r>
+          </w:p>
+        </w:tc>
+        <w:tc>
+          <w:tcPr>
+            <w:tcW w:type="dxa" w:w="2628"/>
+          </w:tcPr>
+          <w:p>
+            <w:r>
+              <w:t>agent 按自己的评审维度查询任务</w:t>
+            </w:r>
+          </w:p>
+        </w:tc>
+        <w:tc>
+          <w:tcPr>
+            <w:tcW w:type="dxa" w:w="2628"/>
+          </w:tcPr>
+          <w:p>
+            <w:r>
+              <w:t>获取该维度下可领取的任务列表，从 tasks[].task_id 读取任务 ID</w:t>
+            </w:r>
+          </w:p>
+        </w:tc>
+      </w:tr>
+      <w:tr>
+        <w:tc>
+          <w:tcPr>
             <w:tcW w:type="dxa" w:w="1440"/>
             <w:vAlign w:val="center"/>
           </w:tcPr>
@@ -697,17 +739,17 @@
         <w:shd w:fill="F5F5F5"/>
       </w:pPr>
       <w:r>
-        <w:t>1. 工程服务调用 /context/index 构建仓库索引，得到 review_tasks</w:t>
+        <w:t>1. 工程服务调用 /context/index 构建仓库索引，生成 review_tasks</w:t>
         <w:br/>
-        <w:t>2. 调度器把单个 task 分配给对应 review agent</w:t>
+        <w:t>2. agent 根据自己的 review_dimension 调用 /context/tasks 查询任务</w:t>
         <w:br/>
-        <w:t>3. agent 调用 /context/task-package/{task_id} 获取任务包</w:t>
+        <w:t>3. agent 从 tasks[].task_id 中读取任务 ID</w:t>
         <w:br/>
-        <w:t>4. agent 优先阅读轻量 initial_context，确认目标、关注点和 suggested_next_tool</w:t>
+        <w:t>4. agent 调用 /context/task-package/{task_id} 获取任务包</w:t>
         <w:br/>
-        <w:t>5. agent 调用 /context/tasks/{task_id}/graph-slice 获取任务局部图总览</w:t>
+        <w:t>5. agent 优先阅读轻量 initial_context，确认目标、关注点和 suggested_next_tool</w:t>
         <w:br/>
-        <w:t>6. agent 根据局部图选择重点节点</w:t>
+        <w:t>6. agent 调用 /context/tasks/{task_id}/graph-slice 获取任务局部图总览</w:t>
         <w:br/>
         <w:t>7. 上下文不足时，调用 /context/related-context 补充源码片段和相关符号</w:t>
         <w:br/>
@@ -721,7 +763,7 @@
         <w:spacing w:after="80"/>
       </w:pPr>
       <w:r>
-        <w:t>登录接口安全评审示例：任务目标是检查 POST /login 的输入校验、认证调用和异常处理。agent 先获取 task package，读取轻量 initial_context；随后调用 graph-slice 查看 task-local 调用关系。如果发现 login() 调用了 authenticate() 且缺少实现，则调用 node-detail 或 related-context；如果需要追踪上游入口，再调用 callers。任务结束后通过 task-feedback 反馈任务状态。</w:t>
+        <w:t>登录接口安全评审示例：任务目标是检查 POST /login 的输入校验、认证调用和异常处理。agent 先调用 /context/tasks?repo_id=sample-repo&amp;review_dimension=security 查询安全维度任务，从 tasks[].task_id 中读取任务 ID；随后调用 task-package 获取任务包，读取轻量 initial_context；再调用 graph-slice 查看 task-local 调用关系。如果发现 login() 调用了 authenticate() 且缺少实现，则调用 node-detail 或 related-context；如果需要追踪上游入口，再调用 callers。</w:t>
       </w:r>
     </w:p>
     <w:p>
@@ -827,6 +869,48 @@
       <w:tr>
         <w:tc>
           <w:tcPr>
+            <w:tcW w:type="dxa" w:w="2628"/>
+          </w:tcPr>
+          <w:p>
+            <w:r>
+              <w:t>GET /context/tasks</w:t>
+            </w:r>
+          </w:p>
+        </w:tc>
+        <w:tc>
+          <w:tcPr>
+            <w:tcW w:type="dxa" w:w="2628"/>
+          </w:tcPr>
+          <w:p>
+            <w:r>
+              <w:t>Query</w:t>
+            </w:r>
+          </w:p>
+        </w:tc>
+        <w:tc>
+          <w:tcPr>
+            <w:tcW w:type="dxa" w:w="2628"/>
+          </w:tcPr>
+          <w:p>
+            <w:r>
+              <w:t>repo_id, review_dimension</w:t>
+            </w:r>
+          </w:p>
+        </w:tc>
+        <w:tc>
+          <w:tcPr>
+            <w:tcW w:type="dxa" w:w="2628"/>
+          </w:tcPr>
+          <w:p>
+            <w:r>
+              <w:t>repo_id, review_dimension, tasks</w:t>
+            </w:r>
+          </w:p>
+        </w:tc>
+      </w:tr>
+      <w:tr>
+        <w:tc>
+          <w:tcPr>
             <w:tcW w:type="dxa" w:w="3024"/>
             <w:vAlign w:val="center"/>
           </w:tcPr>
@@ -1330,16 +1414,28 @@
       </w:r>
     </w:p>
     <w:p>
+      <w:pPr/>
+      <w:r>
+        <w:t>GET /context/tasks?repo_id=sample-repo&amp;review_dimension=security</w:t>
+        <w:br/>
+        <w:br/>
+        <w:t>作用：下游 agent 按固定 review_dimension 枚举查询任务列表。review_dimension 必须使用 security、function_logic、coding_style、requirement_consistency 之一。接口返回 tasks[]，下游 agent 从 tasks[].task_id 中读取任务 ID，再调用 /context/task-package/{task_id}?repo_id={repo_id} 获取完整任务包。</w:t>
+      </w:r>
+    </w:p>
+    <w:p>
       <w:pPr>
         <w:pStyle w:val="Heading2"/>
       </w:pPr>
       <w:r>
-        <w:rPr>
-          <w:rFonts w:ascii="Microsoft YaHei" w:hAnsi="Microsoft YaHei" w:eastAsia="Microsoft YaHei"/>
-          <w:color w:val="2E74B5"/>
-          <w:sz w:val="26"/>
-        </w:rPr>
-        <w:t>4.1 任务包接口：GET /context/task-package/{task_id}</w:t>
+        <w:t>4.1 任务列表接口：GET /context/tasks</w:t>
+      </w:r>
+    </w:p>
+    <w:p>
+      <w:pPr>
+        <w:pStyle w:val="Heading2"/>
+      </w:pPr>
+      <w:r>
+        <w:t>4.2 任务包接口：GET /context/task-package/{task_id}</w:t>
       </w:r>
     </w:p>
     <w:p>
@@ -1993,12 +2089,7 @@
         <w:pStyle w:val="Heading2"/>
       </w:pPr>
       <w:r>
-        <w:rPr>
-          <w:rFonts w:ascii="Microsoft YaHei" w:hAnsi="Microsoft YaHei" w:eastAsia="Microsoft YaHei"/>
-          <w:color w:val="2E74B5"/>
-          <w:sz w:val="26"/>
-        </w:rPr>
-        <w:t>4.2 相关上下文工具：POST /context/related-context</w:t>
+        <w:t>4.3 相关上下文工具：POST /context/related-context</w:t>
       </w:r>
     </w:p>
     <w:p>
@@ -2417,6 +2508,17 @@
             <w:vAlign w:val="center"/>
           </w:tcPr>
           <w:p>
+            <w:r>
+              <w:t>enum</w:t>
+            </w:r>
+          </w:p>
+        </w:tc>
+        <w:tc>
+          <w:tcPr>
+            <w:tcW w:type="dxa" w:w="1152"/>
+            <w:vAlign w:val="center"/>
+          </w:tcPr>
+          <w:p>
             <w:r/>
             <w:r>
               <w:rPr>
@@ -2424,23 +2526,6 @@
                 <w:b w:val="0"/>
                 <w:sz w:val="16"/>
               </w:rPr>
-              <w:t>string</w:t>
-            </w:r>
-          </w:p>
-        </w:tc>
-        <w:tc>
-          <w:tcPr>
-            <w:tcW w:type="dxa" w:w="1152"/>
-            <w:vAlign w:val="center"/>
-          </w:tcPr>
-          <w:p>
-            <w:r/>
-            <w:r>
-              <w:rPr>
-                <w:rFonts w:ascii="Microsoft YaHei" w:hAnsi="Microsoft YaHei" w:eastAsia="Microsoft YaHei"/>
-                <w:b w:val="0"/>
-                <w:sz w:val="16"/>
-              </w:rPr>
               <w:t>是</w:t>
             </w:r>
           </w:p>
@@ -2451,14 +2536,8 @@
             <w:vAlign w:val="center"/>
           </w:tcPr>
           <w:p>
-            <w:r/>
-            <w:r>
-              <w:rPr>
-                <w:rFonts w:ascii="Microsoft YaHei" w:hAnsi="Microsoft YaHei" w:eastAsia="Microsoft YaHei"/>
-                <w:b w:val="0"/>
-                <w:sz w:val="16"/>
-              </w:rPr>
-              <w:t>当前评审维度</w:t>
+            <w:r>
+              <w:t>固定枚举：security / function_logic / coding_style / requirement_consistency</w:t>
             </w:r>
           </w:p>
         </w:tc>
@@ -3044,12 +3123,7 @@
         <w:pStyle w:val="Heading2"/>
       </w:pPr>
       <w:r>
-        <w:rPr>
-          <w:rFonts w:ascii="Microsoft YaHei" w:hAnsi="Microsoft YaHei" w:eastAsia="Microsoft YaHei"/>
-          <w:color w:val="2E74B5"/>
-          <w:sz w:val="26"/>
-        </w:rPr>
-        <w:t>4.3 源码片段工具：GET /context/file-snippet</w:t>
+        <w:t>4.4 源码片段工具：GET /context/file-snippet</w:t>
       </w:r>
     </w:p>
     <w:tbl>
@@ -3634,6 +3708,17 @@
             <w:vAlign w:val="center"/>
           </w:tcPr>
           <w:p>
+            <w:r>
+              <w:t>enum</w:t>
+            </w:r>
+          </w:p>
+        </w:tc>
+        <w:tc>
+          <w:tcPr>
+            <w:tcW w:type="dxa" w:w="1440"/>
+            <w:vAlign w:val="center"/>
+          </w:tcPr>
+          <w:p>
             <w:r/>
             <w:r>
               <w:rPr>
@@ -3641,23 +3726,6 @@
                 <w:b w:val="0"/>
                 <w:sz w:val="16"/>
               </w:rPr>
-              <w:t>string</w:t>
-            </w:r>
-          </w:p>
-        </w:tc>
-        <w:tc>
-          <w:tcPr>
-            <w:tcW w:type="dxa" w:w="1440"/>
-            <w:vAlign w:val="center"/>
-          </w:tcPr>
-          <w:p>
-            <w:r/>
-            <w:r>
-              <w:rPr>
-                <w:rFonts w:ascii="Microsoft YaHei" w:hAnsi="Microsoft YaHei" w:eastAsia="Microsoft YaHei"/>
-                <w:b w:val="0"/>
-                <w:sz w:val="16"/>
-              </w:rPr>
               <w:t>建议必填</w:t>
             </w:r>
           </w:p>
@@ -3668,14 +3736,8 @@
             <w:vAlign w:val="center"/>
           </w:tcPr>
           <w:p>
-            <w:r/>
-            <w:r>
-              <w:rPr>
-                <w:rFonts w:ascii="Microsoft YaHei" w:hAnsi="Microsoft YaHei" w:eastAsia="Microsoft YaHei"/>
-                <w:b w:val="0"/>
-                <w:sz w:val="16"/>
-              </w:rPr>
-              <w:t>用于 usage 记录</w:t>
+            <w:r>
+              <w:t>固定枚举：security / function_logic / coding_style / requirement_consistency</w:t>
             </w:r>
           </w:p>
         </w:tc>
@@ -3982,12 +4044,7 @@
         <w:pStyle w:val="Heading2"/>
       </w:pPr>
       <w:r>
-        <w:rPr>
-          <w:rFonts w:ascii="Microsoft YaHei" w:hAnsi="Microsoft YaHei" w:eastAsia="Microsoft YaHei"/>
-          <w:color w:val="2E74B5"/>
-          <w:sz w:val="26"/>
-        </w:rPr>
-        <w:t>4.4 符号详情工具：GET /context/node-detail</w:t>
+        <w:t>4.5 符号详情工具：GET /context/node-detail</w:t>
       </w:r>
     </w:p>
     <w:tbl>
@@ -4398,6 +4455,17 @@
             <w:vAlign w:val="center"/>
           </w:tcPr>
           <w:p>
+            <w:r>
+              <w:t>enum</w:t>
+            </w:r>
+          </w:p>
+        </w:tc>
+        <w:tc>
+          <w:tcPr>
+            <w:tcW w:type="dxa" w:w="1440"/>
+            <w:vAlign w:val="center"/>
+          </w:tcPr>
+          <w:p>
             <w:r/>
             <w:r>
               <w:rPr>
@@ -4405,23 +4473,6 @@
                 <w:b w:val="0"/>
                 <w:sz w:val="16"/>
               </w:rPr>
-              <w:t>string</w:t>
-            </w:r>
-          </w:p>
-        </w:tc>
-        <w:tc>
-          <w:tcPr>
-            <w:tcW w:type="dxa" w:w="1440"/>
-            <w:vAlign w:val="center"/>
-          </w:tcPr>
-          <w:p>
-            <w:r/>
-            <w:r>
-              <w:rPr>
-                <w:rFonts w:ascii="Microsoft YaHei" w:hAnsi="Microsoft YaHei" w:eastAsia="Microsoft YaHei"/>
-                <w:b w:val="0"/>
-                <w:sz w:val="16"/>
-              </w:rPr>
               <w:t>建议必填</w:t>
             </w:r>
           </w:p>
@@ -4432,14 +4483,8 @@
             <w:vAlign w:val="center"/>
           </w:tcPr>
           <w:p>
-            <w:r/>
-            <w:r>
-              <w:rPr>
-                <w:rFonts w:ascii="Microsoft YaHei" w:hAnsi="Microsoft YaHei" w:eastAsia="Microsoft YaHei"/>
-                <w:b w:val="0"/>
-                <w:sz w:val="16"/>
-              </w:rPr>
-              <w:t>用于 usage 记录</w:t>
+            <w:r>
+              <w:t>固定枚举：security / function_logic / coding_style / requirement_consistency</w:t>
             </w:r>
           </w:p>
         </w:tc>
@@ -4852,12 +4897,7 @@
         <w:pStyle w:val="Heading2"/>
       </w:pPr>
       <w:r>
-        <w:rPr>
-          <w:rFonts w:ascii="Microsoft YaHei" w:hAnsi="Microsoft YaHei" w:eastAsia="Microsoft YaHei"/>
-          <w:color w:val="2E74B5"/>
-          <w:sz w:val="26"/>
-        </w:rPr>
-        <w:t>4.5 调用关系工具：GET /context/callees 与 GET /context/callers</w:t>
+        <w:t>4.6 调用关系工具：GET /context/callees 与 GET /context/callers</w:t>
       </w:r>
     </w:p>
     <w:tbl>
@@ -5355,6 +5395,17 @@
             <w:vAlign w:val="center"/>
           </w:tcPr>
           <w:p>
+            <w:r>
+              <w:t>enum</w:t>
+            </w:r>
+          </w:p>
+        </w:tc>
+        <w:tc>
+          <w:tcPr>
+            <w:tcW w:type="dxa" w:w="1440"/>
+            <w:vAlign w:val="center"/>
+          </w:tcPr>
+          <w:p>
             <w:r/>
             <w:r>
               <w:rPr>
@@ -5362,23 +5413,6 @@
                 <w:b w:val="0"/>
                 <w:sz w:val="16"/>
               </w:rPr>
-              <w:t>string</w:t>
-            </w:r>
-          </w:p>
-        </w:tc>
-        <w:tc>
-          <w:tcPr>
-            <w:tcW w:type="dxa" w:w="1440"/>
-            <w:vAlign w:val="center"/>
-          </w:tcPr>
-          <w:p>
-            <w:r/>
-            <w:r>
-              <w:rPr>
-                <w:rFonts w:ascii="Microsoft YaHei" w:hAnsi="Microsoft YaHei" w:eastAsia="Microsoft YaHei"/>
-                <w:b w:val="0"/>
-                <w:sz w:val="16"/>
-              </w:rPr>
               <w:t>建议必填</w:t>
             </w:r>
           </w:p>
@@ -5389,14 +5423,8 @@
             <w:vAlign w:val="center"/>
           </w:tcPr>
           <w:p>
-            <w:r/>
-            <w:r>
-              <w:rPr>
-                <w:rFonts w:ascii="Microsoft YaHei" w:hAnsi="Microsoft YaHei" w:eastAsia="Microsoft YaHei"/>
-                <w:b w:val="0"/>
-                <w:sz w:val="16"/>
-              </w:rPr>
-              <w:t>用于 usage 记录</w:t>
+            <w:r>
+              <w:t>固定枚举：security / function_logic / coding_style / requirement_consistency</w:t>
             </w:r>
           </w:p>
         </w:tc>
@@ -5702,7 +5730,7 @@
     <w:p/>
     <w:p>
       <w:r>
-        <w:t>4.6 任务局部图接口：GET /context/tasks/{task_id}/graph-slice</w:t>
+        <w:t>4.7 任务局部图接口：GET /context/tasks/{task_id}/graph-slice</w:t>
       </w:r>
     </w:p>
     <w:p>
@@ -7253,14 +7281,8 @@
             <w:vAlign w:val="center"/>
           </w:tcPr>
           <w:p>
-            <w:r/>
-            <w:r>
-              <w:rPr>
-                <w:rFonts w:ascii="Microsoft YaHei" w:hAnsi="Microsoft YaHei" w:eastAsia="Microsoft YaHei"/>
-                <w:b w:val="0"/>
-                <w:sz w:val="16"/>
-              </w:rPr>
-              <w:t>用于区分安全、性能、可维护性等不同评审维度</w:t>
+            <w:r>
+              <w:t>用于区分固定评审维度：security / function_logic / coding_style / requirement_consistency</w:t>
             </w:r>
           </w:p>
         </w:tc>
@@ -7718,6 +7740,18 @@
       </w:r>
     </w:p>
     <w:p>
+      <w:pPr/>
+      <w:r>
+        <w:t>repo_id 说明：repo_id 是一次仓库索引的统一标识，在调用 POST /context/index 时由调用方传入。构建索引后，后续所有接口都应使用同一个 repo_id，包括任务查询、任务包获取、上下文工具调用和任务反馈。repo_id 用于关联仓库摘要、任务列表、任务包、usage 记录和 task feedback。</w:t>
+      </w:r>
+    </w:p>
+    <w:p>
+      <w:pPr/>
+      <w:r>
+        <w:t>task_id 说明：task_id 是 context 模块在生成 review task 时产生的任务标识。下游 agent 可以在获取任务列表时获取 ID，也就是读取 /context/tasks 返回结果中的 tasks[].task_id。拿到 task_id 后，再调用 GET /context/task-package/{task_id}?repo_id={repo_id} 获取完整任务包。后续上下文工具调用和 task-feedback 也应继续携带该 task_id。</w:t>
+      </w:r>
+    </w:p>
+    <w:p>
       <w:pPr>
         <w:pStyle w:val="Heading2"/>
       </w:pPr>
@@ -7781,7 +7815,7 @@
         <w:spacing w:after="80"/>
       </w:pPr>
       <w:r>
-        <w:t>下面示例展示下游 agent 如何获取任务包、先读取 task-local graph slice、再扩展相关上下文，并提交任务反馈。</w:t>
+        <w:t>下面示例展示下游 agent 如何按 review_dimension 查询任务、获取任务包、先读取 task-local graph slice、再扩展相关上下文，并提交任务反馈。</w:t>
       </w:r>
     </w:p>
     <w:p>
@@ -7790,11 +7824,41 @@
         <w:shd w:fill="F5F5F5"/>
       </w:pPr>
       <w:r>
-        <w:t>def get_task_graph_slice():</w:t>
+        <w:t>def list_tasks():</w:t>
         <w:br/>
         <w:t xml:space="preserve">    resp = requests.get(</w:t>
         <w:br/>
-        <w:t xml:space="preserve">        f"{BASE_URL}/context/tasks/{TASK_ID}/graph-slice",</w:t>
+        <w:t xml:space="preserve">        f"{BASE_URL}/context/tasks",</w:t>
+        <w:br/>
+        <w:t xml:space="preserve">        params={"repo_id": REPO_ID, "review_dimension": "security"}</w:t>
+        <w:br/>
+        <w:t xml:space="preserve">    )</w:t>
+        <w:br/>
+        <w:t xml:space="preserve">    resp.raise_for_status()</w:t>
+        <w:br/>
+        <w:t xml:space="preserve">    return resp.json()["tasks"]</w:t>
+        <w:br/>
+        <w:br/>
+        <w:t>def get_task_package(task_id):</w:t>
+        <w:br/>
+        <w:t xml:space="preserve">    resp = requests.get(</w:t>
+        <w:br/>
+        <w:t xml:space="preserve">        f"{BASE_URL}/context/task-package/{task_id}",</w:t>
+        <w:br/>
+        <w:t xml:space="preserve">        params={"repo_id": REPO_ID}</w:t>
+        <w:br/>
+        <w:t xml:space="preserve">    )</w:t>
+        <w:br/>
+        <w:t xml:space="preserve">    resp.raise_for_status()</w:t>
+        <w:br/>
+        <w:t xml:space="preserve">    return resp.json()</w:t>
+        <w:br/>
+        <w:br/>
+        <w:t>def get_task_graph_slice(task_id):</w:t>
+        <w:br/>
+        <w:t xml:space="preserve">    resp = requests.get(</w:t>
+        <w:br/>
+        <w:t xml:space="preserve">        f"{BASE_URL}/context/tasks/{task_id}/graph-slice",</w:t>
         <w:br/>
         <w:t xml:space="preserve">        params={"repo_id": REPO_ID, "depth": 2}</w:t>
         <w:br/>
@@ -7803,13 +7867,6 @@
         <w:t xml:space="preserve">    resp.raise_for_status()</w:t>
         <w:br/>
         <w:t xml:space="preserve">    return resp.json()</w:t>
-        <w:br/>
-        <w:br/>
-        <w:t>task = get_task_package()</w:t>
-        <w:br/>
-        <w:t>graph_slice = get_task_graph_slice()</w:t>
-        <w:br/>
-        <w:t>related_context = get_related_context(task)</w:t>
       </w:r>
     </w:p>
     <w:p>
@@ -7831,11 +7888,7 @@
         <w:ind w:left="288"/>
       </w:pPr>
       <w:r>
-        <w:rPr>
-          <w:rFonts w:ascii="Microsoft YaHei" w:hAnsi="Microsoft YaHei" w:eastAsia="Microsoft YaHei"/>
-          <w:sz w:val="18"/>
-        </w:rPr>
-        <w:t>□ 能从 /context/index 返回值中读取 review_tasks。</w:t>
+        <w:t>□ 能先调用 /context/index 构建索引，再调用 /context/tasks 按 review_dimension 查询任务。</w:t>
       </w:r>
     </w:p>
     <w:p>
@@ -7844,11 +7897,7 @@
         <w:ind w:left="288"/>
       </w:pPr>
       <w:r>
-        <w:rPr>
-          <w:rFonts w:ascii="Microsoft YaHei" w:hAnsi="Microsoft YaHei" w:eastAsia="Microsoft YaHei"/>
-          <w:sz w:val="18"/>
-        </w:rPr>
-        <w:t>□ 每个任务开始前能调用 /context/task-package/{task_id}。</w:t>
+        <w:t>□ 能从 /context/tasks 返回的 tasks[].task_id 中读取任务 ID，并在每个任务开始前调用 /context/task-package/{task_id}。</w:t>
       </w:r>
     </w:p>
     <w:p>
@@ -7888,11 +7937,7 @@
         <w:ind w:left="288"/>
       </w:pPr>
       <w:r>
-        <w:rPr>
-          <w:rFonts w:ascii="Microsoft YaHei" w:hAnsi="Microsoft YaHei" w:eastAsia="Microsoft YaHei"/>
-          <w:sz w:val="18"/>
-        </w:rPr>
-        <w:t>□ 所有上下文工具调用都会带上 task_id 和 review_dimension。</w:t>
+        <w:t>□ 所有上下文工具调用都会带上同一个 repo_id、当前 task_id 和固定枚举 review_dimension。</w:t>
       </w:r>
     </w:p>
     <w:p>
@@ -7928,12 +7973,12 @@
     </w:p>
     <w:p>
       <w:r>
-        <w:t>接口文档开发以真实 FastAPI 应用为准，已导出 docs/api/openapi.json，并生成 docs/api/postman_collection.json。下游工程师可以启动后端后访问 http://127.0.0.1:8000/docs 或 http://127.0.0.1:8000/openapi.json，也可以直接把 Postman Collection 导入 Postman。</w:t>
+        <w:t>接口文档开发以真实 FastAPI 应用为准，已导出 context/docs/api/openapi.json，并生成 context/docs/api/postman_collection.json。下游工程师可以启动后端后访问 http://127.0.0.1:8000/docs 或 http://127.0.0.1:8000/openapi.json，也可以直接把 Postman Collection 导入 Postman。</w:t>
       </w:r>
     </w:p>
     <w:p>
       <w:r>
-        <w:t>推荐调用顺序：/context/index → /context/task-package/{task_id} → /context/tasks/{task_id}/graph-slice → /context/related-context → file-snippet / node-detail / callers / callees → /context/task-feedback。</w:t>
+        <w:t>推荐调用顺序：/context/index → /context/tasks?repo_id={repo_id}&amp;review_dimension={review_dimension} → /context/task-package/{task_id} → /context/tasks/{task_id}/graph-slice → /context/related-context → file-snippet / node-detail / callers / callees → /context/task-feedback。</w:t>
       </w:r>
     </w:p>
     <w:sectPr>

</xml_diff>